<commit_message>
Credit phase BOM usage in productivity indicators
</commit_message>
<xml_diff>
--- a/docs/Guia_de_indicadores_ETRAL_y_trazabilidad_de_datos.docx
+++ b/docs/Guia_de_indicadores_ETRAL_y_trazabilidad_de_datos.docx
@@ -61,24 +61,7 @@
         </w:rPr>
       </w:pPr>
       <w:r>
-        <w:rPr>
-          <w:b/>
-          <w:sz w:val="22"/>
-        </w:rPr>
-      </w:r>
-      <w:r>
-        <w:rPr>
-          <w:b/>
-          <w:sz w:val="22"/>
-        </w:rPr>
-      </w:r>
-      <w:r>
-        <w:rPr>
-          <w:sz w:val="22"/>
-        </w:rPr>
-      </w:r>
-      <w:r>
-        <w:t>Alcance de las capturas. Las pantallas del tablero se capturaron el 26 de octubre de 2026 en el modo demostración de ETRAL. Las capturas de los campos económicos se actualizaron el 27 de octubre de 2026. Las cifras del modo demostración son ilustrativas y no representan la base operativa.</w:t>
+        <w:t>Alcance de las capturas. Las pantallas se capturaron en el modo demostración de ETRAL y sus cifras son ilustrativas. Las tarjetas de materiales y productividad multifactorial se actualizaron el 27 de octubre de 2026 para mostrar el avance acreditado y los importes pendientes. No representan la base operativa.</w:t>
       </w:r>
     </w:p>
     <w:p>
@@ -162,7 +145,7 @@
         </w:rPr>
       </w:pPr>
       <w:r>
-        <w:t>Figura 1. Tablero de indicadores en el periodo seleccionado. Las tarjetas sin resultado indican el dato que aún falta.</w:t>
+        <w:t>Figura 1. Tablero de indicadores del periodo ilustrativo. El avance de fases acredita cantidades de materiales; su valoración monetaria se muestra por separado.</w:t>
       </w:r>
     </w:p>
     <w:p>
@@ -7123,7 +7106,7 @@
         </w:rPr>
       </w:pPr>
       <w:r>
-        <w:t>Figura 12. La tarjeta indica si falta consumo o costo unitario del material.</w:t>
+        <w:t>Figura 12. El CECO terminado acredita cantidades por fase y BOM; falta valorizarlas con costos unitarios.</w:t>
       </w:r>
     </w:p>
     <w:p>
@@ -7134,17 +7117,7 @@
         </w:rPr>
       </w:pPr>
       <w:r>
-        <w:rPr>
-          <w:sz w:val="22"/>
-        </w:rPr>
-      </w:r>
-      <w:r>
-        <w:rPr>
-          <w:sz w:val="22"/>
-        </w:rPr>
-      </w:r>
-      <w:r>
-        <w:t>El numerador son las unidades terminadas. El denominador es el costo de material utilizado por sus CECO: cantidad entregada o consumida × costo unitario. La aplicación revisa cada material por separado y prioriza reserva consumida, salida de inventario, movimiento de consumo y salida de almacén, sin duplicar una misma entrega. El avance de fase o actividad y la reserva BOM no acreditan por sí solos una salida. La entrega desde el detalle del CECO identifica fase y actividad; el costo unitario se registra en el maestro de materiales.</w:t>
+        <w:t>El numerador son las unidades terminadas. Para cada CECO cerrado, el avance de sus fases acredita las cantidades requeridas en sus reservas BOM, aunque no se haya registrado una salida de almacén adicional. Si existe una salida o un consumo explícito, se prioriza y solo se estima la diferencia para evitar duplicación. La cantidad inferida se identifica como estimación por avance de fase. El denominador monetario es la suma de cantidad × costo unitario por material; las cantidades por sí solas no fijan un valor en soles.</w:t>
       </w:r>
     </w:p>
     <w:tbl>
@@ -7444,7 +7417,7 @@
           </w:tcPr>
           <w:p>
             <w:r>
-              <w:t>Suma de cantidad entregada o consumida × costo unitario por material, sin duplicar reserva, movimiento y almacén.</w:t>
+              <w:t>Cantidad de salida o consumo explícito y, si falta, cantidad imputada por fase terminada y reserva BOM; cada material se multiplica por su costo unitario.</w:t>
             </w:r>
           </w:p>
         </w:tc>
@@ -7578,7 +7551,7 @@
           </w:tcPr>
           <w:p>
             <w:r>
-              <w:t>Indica la fuente por material y advierte cuando no hay entrega/consumo o falta costo unitario.</w:t>
+              <w:t>Distingue salida explícita de estimación por avance de fase/BOM y advierte si falta costo unitario.</w:t>
             </w:r>
           </w:p>
         </w:tc>
@@ -7601,17 +7574,7 @@
         </w:rPr>
       </w:pPr>
       <w:r>
-        <w:rPr>
-          <w:sz w:val="22"/>
-        </w:rPr>
-      </w:r>
-      <w:r>
-        <w:rPr>
-          <w:sz w:val="22"/>
-        </w:rPr>
-      </w:r>
-      <w:r>
-        <w:t>La reserva expresa necesidad y compromiso de stock; la entrega o el consumo documentan material utilizado. Las columnas de materia prima e insumos permanecen vacías hasta contar con un desglose verificable. No se reparte el costo total entre ambas por suposición.</w:t>
+        <w:t>La reserva expresa la necesidad de material por fase. Al cerrar la fase o el CECO, esa cantidad se imputa al avance; una salida explícita conserva prioridad como evidencia del movimiento. Las columnas de materia prima e insumos permanecen vacías hasta contar con un desglose verificable. No se reparte el costo total entre ambas por suposición.</w:t>
       </w:r>
     </w:p>
     <w:p>
@@ -7712,7 +7675,7 @@
         </w:rPr>
       </w:pPr>
       <w:r>
-        <w:t>Figura 13. La tarjeta identifica los factores económicos pendientes.</w:t>
+        <w:t>Figura 13. Las cantidades y las horas están registradas; la tarjeta distingue los importes monetarios pendientes.</w:t>
       </w:r>
     </w:p>
     <w:p>
@@ -8235,23 +8198,7 @@
         </w:rPr>
       </w:pPr>
       <w:r>
-        <w:rPr>
-          <w:b/>
-          <w:sz w:val="22"/>
-        </w:rPr>
-      </w:r>
-      <w:r>
-        <w:rPr>
-          <w:sz w:val="22"/>
-        </w:rPr>
-      </w:r>
-      <w:r>
-        <w:rPr>
-          <w:sz w:val="22"/>
-        </w:rPr>
-      </w:r>
-      <w:r>
-        <w:t>El conjunto de demostración conserva campos económicos vacíos, por eso la captura del resultado muestra un valor pendiente. En la base operativa revisada hay avances y partes diarios, pero no entregas ni consumos de material por CECO ni importes suficientes para completar esta razón. La aplicación no sustituye esos valores ausentes por cero.</w:t>
+        <w:t>Los tres CECO cerrados de la base revisada tienen actividades terminadas, horas y 299 líneas de reservas BOM vinculadas a sus fases. El cálculo reconoce esas cantidades; no corresponde decir que faltó movimiento solo porque no exista una salida de almacén independiente. Sus materiales todavía no tienen costo unitario positivo y los importes monetarios del CECO y del personal están vacíos. Por eso la razón en soles permanece sin cifra. Los campos para completarlos ya están en Inventario, Recursos y Datos complementarios del CECO.</w:t>
       </w:r>
     </w:p>
     <w:p>
@@ -9159,41 +9106,7 @@
         </w:rPr>
       </w:pPr>
       <w:r>
-        <w:rPr>
-          <w:sz w:val="22"/>
-        </w:rPr>
-      </w:r>
-      <w:proofErr w:type="spellStart"/>
-      <w:r>
-        <w:rPr>
-          <w:sz w:val="22"/>
-        </w:rPr>
-      </w:r>
-      <w:proofErr w:type="spellEnd"/>
-      <w:r>
-        <w:rPr>
-          <w:sz w:val="22"/>
-        </w:rPr>
-      </w:r>
-      <w:r>
-        <w:rPr>
-          <w:sz w:val="22"/>
-        </w:rPr>
-      </w:r>
-      <w:proofErr w:type="gramStart"/>
-      <w:r>
-        <w:rPr>
-          <w:sz w:val="22"/>
-        </w:rPr>
-      </w:r>
-      <w:proofErr w:type="gramEnd"/>
-      <w:r>
-        <w:rPr>
-          <w:sz w:val="22"/>
-        </w:rPr>
-      </w:r>
-      <w:r>
-        <w:t>En Stock seguridad, “SS según tesis” puede usar dp y s1 estimados del periodo y queda vacío si falta algún parámetro. “SS operativo” usa los parámetros guardados o conserva el mínimo previo. Observaciones declara las estimaciones y carencias. En Ficha productividad, el costo laboral usa la tarifa del trabajador cuando el parte no tiene una tarifa propia; materia prima e insumos quedan vacíos aunque exista un costo total sin desglose.</w:t>
+        <w:t>En Stock seguridad, “SS según tesis” puede usar dp y s1 estimados del periodo y queda vacío si falta algún parámetro. “SS operativo” usa los parámetros guardados o conserva el mínimo previo. Observaciones declara las estimaciones y carencias. En Ficha productividad, la columna Observaciones distingue salidas explícitas de cantidades imputadas por avance de fase/BOM; el costo laboral usa la tarifa del trabajador cuando el parte no tiene una tarifa propia. Materia prima e insumos quedan vacíos si el costo total carece de desglose.</w:t>
       </w:r>
     </w:p>
     <w:p>
@@ -9981,7 +9894,7 @@
           </w:tcPr>
           <w:p>
             <w:r>
-              <w:t>El costo unitario se registra en Inventario &gt; Editar material; la ficha aún no separa materia prima e insumos.</w:t>
+              <w:t>El avance de las fases acredita cantidades BOM; el costo unitario se registra en Inventario &gt; Editar material. La ficha aún no separa materia prima e insumos.</w:t>
             </w:r>
           </w:p>
         </w:tc>
@@ -10005,7 +9918,7 @@
           </w:tcPr>
           <w:p>
             <w:r>
-              <w:t>Completar el costo por material utilizado y documentar el desglose antes de usar las columnas separadas.</w:t>
+              <w:t>Validar la cantidad imputada por fase y completar el costo unitario del material utilizado para expresar la productividad en soles.</w:t>
             </w:r>
           </w:p>
         </w:tc>

</xml_diff>

<commit_message>
Mostrar resultados monetarios en la guía de indicadores
</commit_message>
<xml_diff>
--- a/docs/Guia_de_indicadores_ETRAL_y_trazabilidad_de_datos.docx
+++ b/docs/Guia_de_indicadores_ETRAL_y_trazabilidad_de_datos.docx
@@ -61,7 +61,7 @@
         </w:rPr>
       </w:pPr>
       <w:r>
-        <w:t>Alcance de las capturas. Las pantallas se capturaron en el modo demostración de ETRAL y sus cifras son ilustrativas. Las tarjetas de materiales y productividad multifactorial se actualizaron el 27 de octubre de 2026 para mostrar el avance acreditado y los importes pendientes. No representan la base operativa.</w:t>
+        <w:t>Alcance de las capturas. Las pantallas son del modo demostración de ETRAL y sus cifras son ilustrativas. Para mostrar el cálculo monetario, el escenario de la captura asigna S/ 10 de costo unitario a cada material, S/ 20 por hora a cada trabajador y, por CECO, S/ 5 000 de valor producido, S/ 100 de energía y S/ 200 de capital. Estos importes sirven para enseñar las fórmulas; no representan precios ni costos de la base operativa.</w:t>
       </w:r>
     </w:p>
     <w:p>
@@ -72,16 +72,7 @@
         </w:rPr>
       </w:pPr>
       <w:r>
-        <w:rPr>
-          <w:sz w:val="22"/>
-        </w:rPr>
-        <w:t xml:space="preserve">En el ejemplo capturado, 3 ÷ 11 = 27,3 % de cumplimiento PMP; 11 ÷ 16 = 68,8 % </w:t>
-      </w:r>
-      <w:r>
-        <w:rPr>
-          <w:sz w:val="22"/>
-        </w:rPr>
-        <w:t>de avance; 32 ÷ 34 = 94,1 % de cobertura; y 3 ÷ 34,5 = 0,087 unidades por hora hombre. Estos cocientes permiten verificar la lectura de las tarjetas.</w:t>
+        <w:t>En el ejemplo capturado, 3 ÷ 11 = 27,3 % de cumplimiento PMP; 11 ÷ 16 = 68,8 % de avance; 32 ÷ 34 = 94,1 % de cobertura; y 3 ÷ 34,5 = 0,087 unidades por hora hombre. Con los importes didácticos, materiales = 3 ÷ S/ 260 = 0,0115 und/S/ y multifactorial = S/ 15 000 ÷ (S/ 260 + S/ 690 + S/ 900) = 8,108. Las siete tarjetas tienen resultado en este escenario.</w:t>
       </w:r>
     </w:p>
     <w:p>
@@ -145,7 +136,7 @@
         </w:rPr>
       </w:pPr>
       <w:r>
-        <w:t>Figura 1. Tablero de indicadores del periodo ilustrativo. El avance de fases acredita cantidades de materiales; su valoración monetaria se muestra por separado.</w:t>
+        <w:t>Figura 1. Tablero de demostración con los siete resultados calculados. El avance de fases acredita cantidades de materiales por CECO y BOM; los importes usados se explican en esta guía.</w:t>
       </w:r>
     </w:p>
     <w:p>
@@ -180,6 +171,7 @@
         <w:trPr>
           <w:tblHeader/>
           <w:jc w:val="center"/>
+          <w:cantSplit/>
         </w:trPr>
         <w:tc>
           <w:tcPr>
@@ -293,6 +285,7 @@
       <w:tr>
         <w:trPr>
           <w:jc w:val="center"/>
+          <w:cantSplit/>
         </w:trPr>
         <w:tc>
           <w:tcPr>
@@ -397,6 +390,7 @@
       <w:tr>
         <w:trPr>
           <w:jc w:val="center"/>
+          <w:cantSplit/>
         </w:trPr>
         <w:tc>
           <w:tcPr>
@@ -510,6 +504,7 @@
       <w:tr>
         <w:trPr>
           <w:jc w:val="center"/>
+          <w:cantSplit/>
         </w:trPr>
         <w:tc>
           <w:tcPr>
@@ -614,6 +609,7 @@
       <w:tr>
         <w:trPr>
           <w:jc w:val="center"/>
+          <w:cantSplit/>
         </w:trPr>
         <w:tc>
           <w:tcPr>
@@ -735,6 +731,7 @@
       <w:tr>
         <w:trPr>
           <w:jc w:val="center"/>
+          <w:cantSplit/>
         </w:trPr>
         <w:tc>
           <w:tcPr>
@@ -852,6 +849,7 @@
       <w:tr>
         <w:trPr>
           <w:jc w:val="center"/>
+          <w:cantSplit/>
         </w:trPr>
         <w:tc>
           <w:tcPr>
@@ -960,6 +958,7 @@
       <w:tr>
         <w:trPr>
           <w:jc w:val="center"/>
+          <w:cantSplit/>
         </w:trPr>
         <w:tc>
           <w:tcPr>
@@ -1064,6 +1063,7 @@
       <w:tr>
         <w:trPr>
           <w:jc w:val="center"/>
+          <w:cantSplit/>
         </w:trPr>
         <w:tc>
           <w:tcPr>
@@ -1255,6 +1255,7 @@
         <w:trPr>
           <w:tblHeader/>
           <w:jc w:val="center"/>
+          <w:cantSplit/>
         </w:trPr>
         <w:tc>
           <w:tcPr>
@@ -1332,6 +1333,7 @@
       <w:tr>
         <w:trPr>
           <w:jc w:val="center"/>
+          <w:cantSplit/>
         </w:trPr>
         <w:tc>
           <w:tcPr>
@@ -1403,6 +1405,7 @@
       <w:tr>
         <w:trPr>
           <w:jc w:val="center"/>
+          <w:cantSplit/>
         </w:trPr>
         <w:tc>
           <w:tcPr>
@@ -1476,6 +1479,7 @@
       <w:tr>
         <w:trPr>
           <w:jc w:val="center"/>
+          <w:cantSplit/>
         </w:trPr>
         <w:tc>
           <w:tcPr>
@@ -1553,6 +1557,7 @@
       <w:tr>
         <w:trPr>
           <w:jc w:val="center"/>
+          <w:cantSplit/>
         </w:trPr>
         <w:tc>
           <w:tcPr>
@@ -1626,6 +1631,7 @@
       <w:tr>
         <w:trPr>
           <w:jc w:val="center"/>
+          <w:cantSplit/>
         </w:trPr>
         <w:tc>
           <w:tcPr>
@@ -1753,6 +1759,7 @@
         <w:trPr>
           <w:tblHeader/>
           <w:jc w:val="center"/>
+          <w:cantSplit/>
         </w:trPr>
         <w:tc>
           <w:tcPr>
@@ -1830,6 +1837,7 @@
       <w:tr>
         <w:trPr>
           <w:jc w:val="center"/>
+          <w:cantSplit/>
         </w:trPr>
         <w:tc>
           <w:tcPr>
@@ -1907,6 +1915,7 @@
       <w:tr>
         <w:trPr>
           <w:jc w:val="center"/>
+          <w:cantSplit/>
         </w:trPr>
         <w:tc>
           <w:tcPr>
@@ -1980,6 +1989,7 @@
       <w:tr>
         <w:trPr>
           <w:jc w:val="center"/>
+          <w:cantSplit/>
         </w:trPr>
         <w:tc>
           <w:tcPr>
@@ -2051,6 +2061,7 @@
       <w:tr>
         <w:trPr>
           <w:jc w:val="center"/>
+          <w:cantSplit/>
         </w:trPr>
         <w:tc>
           <w:tcPr>
@@ -2130,6 +2141,7 @@
       <w:tr>
         <w:trPr>
           <w:jc w:val="center"/>
+          <w:cantSplit/>
         </w:trPr>
         <w:tc>
           <w:tcPr>
@@ -2322,6 +2334,7 @@
         <w:trPr>
           <w:tblHeader/>
           <w:jc w:val="center"/>
+          <w:cantSplit/>
         </w:trPr>
         <w:tc>
           <w:tcPr>
@@ -2399,6 +2412,7 @@
       <w:tr>
         <w:trPr>
           <w:jc w:val="center"/>
+          <w:cantSplit/>
         </w:trPr>
         <w:tc>
           <w:tcPr>
@@ -2476,6 +2490,7 @@
       <w:tr>
         <w:trPr>
           <w:jc w:val="center"/>
+          <w:cantSplit/>
         </w:trPr>
         <w:tc>
           <w:tcPr>
@@ -2549,6 +2564,7 @@
       <w:tr>
         <w:trPr>
           <w:jc w:val="center"/>
+          <w:cantSplit/>
         </w:trPr>
         <w:tc>
           <w:tcPr>
@@ -2621,6 +2637,7 @@
       <w:tr>
         <w:trPr>
           <w:jc w:val="center"/>
+          <w:cantSplit/>
         </w:trPr>
         <w:tc>
           <w:tcPr>
@@ -2700,6 +2717,7 @@
       <w:tr>
         <w:trPr>
           <w:jc w:val="center"/>
+          <w:cantSplit/>
         </w:trPr>
         <w:tc>
           <w:tcPr>
@@ -2761,6 +2779,7 @@
       <w:tr>
         <w:trPr>
           <w:jc w:val="center"/>
+          <w:cantSplit/>
         </w:trPr>
         <w:tc>
           <w:tcPr>
@@ -2968,6 +2987,7 @@
         <w:trPr>
           <w:tblHeader/>
           <w:jc w:val="center"/>
+          <w:cantSplit/>
         </w:trPr>
         <w:tc>
           <w:tcPr>
@@ -3053,6 +3073,7 @@
       <w:tr>
         <w:trPr>
           <w:jc w:val="center"/>
+          <w:cantSplit/>
         </w:trPr>
         <w:tc>
           <w:tcPr>
@@ -3124,6 +3145,7 @@
       <w:tr>
         <w:trPr>
           <w:jc w:val="center"/>
+          <w:cantSplit/>
         </w:trPr>
         <w:tc>
           <w:tcPr>
@@ -3197,6 +3219,7 @@
       <w:tr>
         <w:trPr>
           <w:jc w:val="center"/>
+          <w:cantSplit/>
         </w:trPr>
         <w:tc>
           <w:tcPr>
@@ -3268,6 +3291,7 @@
       <w:tr>
         <w:trPr>
           <w:jc w:val="center"/>
+          <w:cantSplit/>
         </w:trPr>
         <w:tc>
           <w:tcPr>
@@ -3347,6 +3371,7 @@
       <w:tr>
         <w:trPr>
           <w:jc w:val="center"/>
+          <w:cantSplit/>
         </w:trPr>
         <w:tc>
           <w:tcPr>
@@ -3559,6 +3584,7 @@
         <w:trPr>
           <w:tblHeader/>
           <w:jc w:val="center"/>
+          <w:cantSplit/>
         </w:trPr>
         <w:tc>
           <w:tcPr>
@@ -3636,6 +3662,7 @@
       <w:tr>
         <w:trPr>
           <w:jc w:val="center"/>
+          <w:cantSplit/>
         </w:trPr>
         <w:tc>
           <w:tcPr>
@@ -3707,6 +3734,7 @@
       <w:tr>
         <w:trPr>
           <w:jc w:val="center"/>
+          <w:cantSplit/>
         </w:trPr>
         <w:tc>
           <w:tcPr>
@@ -3782,6 +3810,7 @@
       <w:tr>
         <w:trPr>
           <w:jc w:val="center"/>
+          <w:cantSplit/>
         </w:trPr>
         <w:tc>
           <w:tcPr>
@@ -3853,6 +3882,7 @@
       <w:tr>
         <w:trPr>
           <w:jc w:val="center"/>
+          <w:cantSplit/>
         </w:trPr>
         <w:tc>
           <w:tcPr>
@@ -3928,6 +3958,7 @@
       <w:tr>
         <w:trPr>
           <w:jc w:val="center"/>
+          <w:cantSplit/>
         </w:trPr>
         <w:tc>
           <w:tcPr>
@@ -3999,6 +4030,7 @@
       <w:tr>
         <w:trPr>
           <w:jc w:val="center"/>
+          <w:cantSplit/>
         </w:trPr>
         <w:tc>
           <w:tcPr>
@@ -4073,6 +4105,7 @@
       <w:tr>
         <w:trPr>
           <w:jc w:val="center"/>
+          <w:cantSplit/>
         </w:trPr>
         <w:tc>
           <w:tcPr>
@@ -4172,6 +4205,7 @@
       <w:tr>
         <w:trPr>
           <w:jc w:val="center"/>
+          <w:cantSplit/>
         </w:trPr>
         <w:tc>
           <w:tcPr>
@@ -4251,6 +4285,7 @@
       <w:tr>
         <w:trPr>
           <w:jc w:val="center"/>
+          <w:cantSplit/>
         </w:trPr>
         <w:tc>
           <w:tcPr>
@@ -4322,6 +4357,7 @@
       <w:tr>
         <w:trPr>
           <w:jc w:val="center"/>
+          <w:cantSplit/>
         </w:trPr>
         <w:tc>
           <w:tcPr>
@@ -4467,6 +4503,7 @@
         <w:trPr>
           <w:tblHeader/>
           <w:jc w:val="center"/>
+          <w:cantSplit/>
         </w:trPr>
         <w:tc>
           <w:tcPr>
@@ -4552,6 +4589,7 @@
       <w:tr>
         <w:trPr>
           <w:jc w:val="center"/>
+          <w:cantSplit/>
         </w:trPr>
         <w:tc>
           <w:tcPr>
@@ -4623,6 +4661,7 @@
       <w:tr>
         <w:trPr>
           <w:jc w:val="center"/>
+          <w:cantSplit/>
         </w:trPr>
         <w:tc>
           <w:tcPr>
@@ -4696,6 +4735,7 @@
       <w:tr>
         <w:trPr>
           <w:jc w:val="center"/>
+          <w:cantSplit/>
         </w:trPr>
         <w:tc>
           <w:tcPr>
@@ -4773,6 +4813,7 @@
       <w:tr>
         <w:trPr>
           <w:jc w:val="center"/>
+          <w:cantSplit/>
         </w:trPr>
         <w:tc>
           <w:tcPr>
@@ -4905,7 +4946,7 @@
         <w:pStyle w:val="Figurecaption"/>
       </w:pPr>
       <w:r>
-        <w:t>Figura 5. Campo de costo unitario del material, necesario para valorar la entrega o el consumo.</w:t>
+        <w:t>Figura 5. Costo unitario didáctico de S/ 10 registrado en el material para valorar las cantidades acreditadas.</w:t>
       </w:r>
     </w:p>
     <w:p>
@@ -4950,6 +4991,7 @@
         <w:trPr>
           <w:tblHeader/>
           <w:jc w:val="center"/>
+          <w:cantSplit/>
         </w:trPr>
         <w:tc>
           <w:tcPr>
@@ -5027,6 +5069,7 @@
       <w:tr>
         <w:trPr>
           <w:jc w:val="center"/>
+          <w:cantSplit/>
         </w:trPr>
         <w:tc>
           <w:tcPr>
@@ -5105,6 +5148,7 @@
       <w:tr>
         <w:trPr>
           <w:jc w:val="center"/>
+          <w:cantSplit/>
         </w:trPr>
         <w:tc>
           <w:tcPr>
@@ -5178,6 +5222,7 @@
       <w:tr>
         <w:trPr>
           <w:jc w:val="center"/>
+          <w:cantSplit/>
         </w:trPr>
         <w:tc>
           <w:tcPr>
@@ -5249,6 +5294,7 @@
       <w:tr>
         <w:trPr>
           <w:jc w:val="center"/>
+          <w:cantSplit/>
         </w:trPr>
         <w:tc>
           <w:tcPr>
@@ -5328,6 +5374,7 @@
       <w:tr>
         <w:trPr>
           <w:jc w:val="center"/>
+          <w:cantSplit/>
         </w:trPr>
         <w:tc>
           <w:tcPr>
@@ -5389,6 +5436,7 @@
       <w:tr>
         <w:trPr>
           <w:jc w:val="center"/>
+          <w:cantSplit/>
         </w:trPr>
         <w:tc>
           <w:tcPr>
@@ -5602,7 +5650,7 @@
         <w:pStyle w:val="Figurecaption"/>
       </w:pPr>
       <w:r>
-        <w:t>Figura 7. Tarifa laboral por hora en Recursos &gt; Personal.</w:t>
+        <w:t>Figura 7. Tarifa laboral didáctica de S/ 20 por hora en Recursos &gt; Personal.</w:t>
       </w:r>
     </w:p>
     <w:p>
@@ -5683,7 +5731,7 @@
         </w:rPr>
       </w:pPr>
       <w:r>
-        <w:t>Figura 8. El CECO terminado acredita cantidades por fase y BOM; falta valorizarlas con costos unitarios.</w:t>
+        <w:t>Figura 8. Productividad de materiales del escenario: 3 unidades ÷ S/ 260 de materiales = 0,0115 und/S/. Las cantidades proceden del avance de fases y la BOM.</w:t>
       </w:r>
     </w:p>
     <w:p>
@@ -5712,6 +5760,7 @@
         <w:trPr>
           <w:tblHeader/>
           <w:jc w:val="center"/>
+          <w:cantSplit/>
         </w:trPr>
         <w:tc>
           <w:tcPr>
@@ -5797,6 +5846,7 @@
       <w:tr>
         <w:trPr>
           <w:jc w:val="center"/>
+          <w:cantSplit/>
         </w:trPr>
         <w:tc>
           <w:tcPr>
@@ -5868,6 +5918,7 @@
       <w:tr>
         <w:trPr>
           <w:jc w:val="center"/>
+          <w:cantSplit/>
         </w:trPr>
         <w:tc>
           <w:tcPr>
@@ -5941,6 +5992,7 @@
       <w:tr>
         <w:trPr>
           <w:jc w:val="center"/>
+          <w:cantSplit/>
         </w:trPr>
         <w:tc>
           <w:tcPr>
@@ -6002,6 +6054,7 @@
       <w:tr>
         <w:trPr>
           <w:jc w:val="center"/>
+          <w:cantSplit/>
         </w:trPr>
         <w:tc>
           <w:tcPr>
@@ -6075,6 +6128,7 @@
       <w:tr>
         <w:trPr>
           <w:jc w:val="center"/>
+          <w:cantSplit/>
         </w:trPr>
         <w:tc>
           <w:tcPr>
@@ -6252,7 +6306,7 @@
         </w:rPr>
       </w:pPr>
       <w:r>
-        <w:t>Figura 9. Las cantidades y las horas están registradas; la tarjeta distingue los importes monetarios pendientes.</w:t>
+        <w:t>Figura 9. Productividad multifactorial del escenario: S/ 15 000 ÷ S/ 1 850 de factores = 8,108.</w:t>
       </w:r>
     </w:p>
     <w:p>
@@ -6291,6 +6345,7 @@
         <w:trPr>
           <w:tblHeader/>
           <w:jc w:val="center"/>
+          <w:cantSplit/>
         </w:trPr>
         <w:tc>
           <w:tcPr>
@@ -6368,6 +6423,7 @@
       <w:tr>
         <w:trPr>
           <w:jc w:val="center"/>
+          <w:cantSplit/>
         </w:trPr>
         <w:tc>
           <w:tcPr>
@@ -6429,6 +6485,7 @@
       <w:tr>
         <w:trPr>
           <w:jc w:val="center"/>
+          <w:cantSplit/>
         </w:trPr>
         <w:tc>
           <w:tcPr>
@@ -6492,6 +6549,7 @@
       <w:tr>
         <w:trPr>
           <w:jc w:val="center"/>
+          <w:cantSplit/>
         </w:trPr>
         <w:tc>
           <w:tcPr>
@@ -6563,6 +6621,7 @@
       <w:tr>
         <w:trPr>
           <w:jc w:val="center"/>
+          <w:cantSplit/>
         </w:trPr>
         <w:tc>
           <w:tcPr>
@@ -6626,6 +6685,7 @@
       <w:tr>
         <w:trPr>
           <w:jc w:val="center"/>
+          <w:cantSplit/>
         </w:trPr>
         <w:tc>
           <w:tcPr>
@@ -6687,6 +6747,7 @@
       <w:tr>
         <w:trPr>
           <w:jc w:val="center"/>
+          <w:cantSplit/>
         </w:trPr>
         <w:tc>
           <w:tcPr>
@@ -6775,7 +6836,7 @@
         </w:rPr>
       </w:pPr>
       <w:r>
-        <w:t>Los tres CECO cerrados de la base revisada tienen actividades terminadas, horas y 299 líneas de reservas BOM vinculadas a sus fases. El cálculo reconoce esas cantidades; no corresponde decir que faltó movimiento solo porque no exista una salida de almacén independiente. Sus materiales todavía no tienen costo unitario positivo y los importes monetarios del CECO y del personal están vacíos. Por eso la razón en soles permanece sin cifra. Los campos para completarlos ya están en Inventario, Recursos y Datos complementarios del CECO.</w:t>
+        <w:t>En el periodo ilustrado hay tres CECO cerrados con fases, horas y reservas BOM vinculadas. La app acredita las cantidades por avance aunque no exista una salida de almacén independiente. Al asignar los importes didácticos declarados al inicio, el costo de materiales suma S/ 260, las 34,5 horas cuestan S/ 690, energía y capital suman S/ 900 y el valor producido llega a S/ 15 000. La razón multifactorial es 15 000 ÷ 1 850 = 8,108. En los registros operativos, cada importe debe provenir de su costo o documento real.</w:t>
       </w:r>
     </w:p>
     <w:p>
@@ -6819,7 +6880,7 @@
         <w:pStyle w:val="Figurecaption"/>
       </w:pPr>
       <w:r>
-        <w:t>Figura 10. Valor producido, energía y capital en Datos complementarios del CECO.</w:t>
+        <w:t>Figura 10. Importes didácticos por CECO: S/ 5 000 de valor producido, S/ 100 de energía y S/ 200 de capital.</w:t>
       </w:r>
     </w:p>
     <w:p>
@@ -6880,6 +6941,7 @@
         <w:trPr>
           <w:tblHeader/>
           <w:jc w:val="center"/>
+          <w:cantSplit/>
         </w:trPr>
         <w:tc>
           <w:tcPr>
@@ -6957,6 +7019,7 @@
       <w:tr>
         <w:trPr>
           <w:jc w:val="center"/>
+          <w:cantSplit/>
         </w:trPr>
         <w:tc>
           <w:tcPr>
@@ -7028,6 +7091,7 @@
       <w:tr>
         <w:trPr>
           <w:jc w:val="center"/>
+          <w:cantSplit/>
         </w:trPr>
         <w:tc>
           <w:tcPr>
@@ -7108,6 +7172,7 @@
       <w:tr>
         <w:trPr>
           <w:jc w:val="center"/>
+          <w:cantSplit/>
         </w:trPr>
         <w:tc>
           <w:tcPr>
@@ -7179,6 +7244,7 @@
       <w:tr>
         <w:trPr>
           <w:jc w:val="center"/>
+          <w:cantSplit/>
         </w:trPr>
         <w:tc>
           <w:tcPr>
@@ -7286,6 +7352,7 @@
       <w:tr>
         <w:trPr>
           <w:jc w:val="center"/>
+          <w:cantSplit/>
         </w:trPr>
         <w:tc>
           <w:tcPr>
@@ -7357,6 +7424,7 @@
       <w:tr>
         <w:trPr>
           <w:jc w:val="center"/>
+          <w:cantSplit/>
         </w:trPr>
         <w:tc>
           <w:tcPr>
@@ -7430,6 +7498,7 @@
       <w:tr>
         <w:trPr>
           <w:jc w:val="center"/>
+          <w:cantSplit/>
         </w:trPr>
         <w:tc>
           <w:tcPr>
@@ -7501,6 +7570,7 @@
       <w:tr>
         <w:trPr>
           <w:jc w:val="center"/>
+          <w:cantSplit/>
         </w:trPr>
         <w:tc>
           <w:tcPr>
@@ -7574,6 +7644,7 @@
       <w:tr>
         <w:trPr>
           <w:jc w:val="center"/>
+          <w:cantSplit/>
         </w:trPr>
         <w:tc>
           <w:tcPr>
@@ -7708,12 +7779,7 @@
         </w:rPr>
       </w:pPr>
       <w:r>
-        <w:rPr>
-          <w:sz w:val="22"/>
-          <w:szCs w:val="22"/>
-        </w:rPr>
-        <w:lastRenderedPageBreak/>
-        <w:t>Datos que requieren registro o ajuste</w:t>
+        <w:t>Datos que requieren registro en la base operativa</w:t>
       </w:r>
     </w:p>
     <w:tbl>
@@ -7732,6 +7798,7 @@
         <w:trPr>
           <w:tblHeader/>
           <w:jc w:val="center"/>
+          <w:cantSplit/>
         </w:trPr>
         <w:tc>
           <w:tcPr>
@@ -7856,6 +7923,7 @@
       <w:tr>
         <w:trPr>
           <w:jc w:val="center"/>
+          <w:cantSplit/>
         </w:trPr>
         <w:tc>
           <w:tcPr>
@@ -7963,6 +8031,7 @@
       <w:tr>
         <w:trPr>
           <w:jc w:val="center"/>
+          <w:cantSplit/>
         </w:trPr>
         <w:tc>
           <w:tcPr>
@@ -8073,6 +8142,7 @@
       <w:tr>
         <w:trPr>
           <w:jc w:val="center"/>
+          <w:cantSplit/>
         </w:trPr>
         <w:tc>
           <w:tcPr>
@@ -8194,6 +8264,7 @@
       <w:tr>
         <w:trPr>
           <w:jc w:val="center"/>
+          <w:cantSplit/>
         </w:trPr>
         <w:tc>
           <w:tcPr>
@@ -8326,6 +8397,7 @@
       <w:tr>
         <w:trPr>
           <w:jc w:val="center"/>
+          <w:cantSplit/>
         </w:trPr>
         <w:tc>
           <w:tcPr>
@@ -8433,6 +8505,7 @@
       <w:tr>
         <w:trPr>
           <w:jc w:val="center"/>
+          <w:cantSplit/>
         </w:trPr>
         <w:tc>
           <w:tcPr>
@@ -8527,6 +8600,7 @@
       <w:tr>
         <w:trPr>
           <w:jc w:val="center"/>
+          <w:cantSplit/>
         </w:trPr>
         <w:tc>
           <w:tcPr>
@@ -8618,6 +8692,7 @@
       <w:tr>
         <w:trPr>
           <w:jc w:val="center"/>
+          <w:cantSplit/>
         </w:trPr>
         <w:tc>
           <w:tcPr>

</xml_diff>